<commit_message>
Update to ISP Checklist
</commit_message>
<xml_diff>
--- a/public/Draft_ISP_Checklist.docx
+++ b/public/Draft_ISP_Checklist.docx
@@ -110,7 +110,6 @@
               <w:calendar w:val="gregorian"/>
             </w:date>
           </w:sdtPr>
-          <w:sdtEndPr/>
           <w:sdtContent>
             <w:tc>
               <w:tcPr>
@@ -488,7 +487,16 @@
                 <w:sz w:val="16"/>
                 <w:szCs w:val="18"/>
               </w:rPr>
-              <w:t>Item Description:</w:t>
+              <w:t>Program</w:t>
+            </w:r>
+            <w:r>
+              <w:rPr>
+                <w:rFonts w:ascii="Times New Roman" w:hAnsi="Times New Roman" w:cs="Times New Roman"/>
+                <w:b/>
+                <w:sz w:val="16"/>
+                <w:szCs w:val="18"/>
+              </w:rPr>
+              <w:t xml:space="preserve"> Description:</w:t>
             </w:r>
           </w:p>
         </w:tc>
@@ -773,7 +781,6 @@
             <w14:uncheckedState w14:val="2610" w14:font="MS Gothic"/>
           </w14:checkbox>
         </w:sdtPr>
-        <w:sdtEndPr/>
         <w:sdtContent>
           <w:r>
             <w:rPr>
@@ -977,7 +984,6 @@
             <w14:uncheckedState w14:val="25CB" w14:font="Times New Roman"/>
           </w14:checkbox>
         </w:sdtPr>
-        <w:sdtEndPr/>
         <w:sdtContent>
           <w:r>
             <w:rPr>
@@ -1027,7 +1033,6 @@
             <w14:uncheckedState w14:val="25CB" w14:font="Times New Roman"/>
           </w14:checkbox>
         </w:sdtPr>
-        <w:sdtEndPr/>
         <w:sdtContent>
           <w:r>
             <w:rPr>
@@ -1547,25 +1552,7 @@
           <w:sz w:val="16"/>
           <w:szCs w:val="18"/>
         </w:rPr>
-        <w:t>CO/Buyer should address in the comments any items marked “U” or “</w:t>
-      </w:r>
-      <w:proofErr w:type="gramStart"/>
-      <w:r>
-        <w:rPr>
-          <w:rFonts w:ascii="Times New Roman" w:hAnsi="Times New Roman" w:cs="Times New Roman"/>
-          <w:sz w:val="16"/>
-          <w:szCs w:val="18"/>
-        </w:rPr>
-        <w:t>NI</w:t>
-      </w:r>
-      <w:proofErr w:type="gramEnd"/>
-      <w:r>
-        <w:rPr>
-          <w:rFonts w:ascii="Times New Roman" w:hAnsi="Times New Roman" w:cs="Times New Roman"/>
-          <w:sz w:val="16"/>
-          <w:szCs w:val="18"/>
-        </w:rPr>
-        <w:t>”</w:t>
+        <w:t>CO/Buyer should address in the comments any items marked “U” or “NI”</w:t>
       </w:r>
     </w:p>
     <w:tbl>
@@ -1639,10 +1626,10 @@
                   <v:path o:extrusionok="f" gradientshapeok="t" o:connecttype="rect"/>
                   <o:lock v:ext="edit" aspectratio="t"/>
                 </v:shapetype>
-                <v:shape id="_x0000_i1036" type="#_x0000_t75" style="width:472pt;height:179pt" o:ole="">
+                <v:shape id="_x0000_i1054" type="#_x0000_t75" style="width:472pt;height:179pt" o:ole="">
                   <v:imagedata r:id="rId11" o:title="" cropbottom="3599f" cropright="22693f"/>
                 </v:shape>
-                <o:OLEObject Type="Embed" ProgID="Excel.Sheet.12" ShapeID="_x0000_i1036" DrawAspect="Content" ObjectID="_1779602189" r:id="rId12"/>
+                <o:OLEObject Type="Embed" ProgID="Excel.Sheet.12" ShapeID="_x0000_i1054" DrawAspect="Content" ObjectID="_1794814629" r:id="rId12"/>
               </w:object>
             </w:r>
           </w:p>
@@ -1919,7 +1906,6 @@
               <w:listItem w:displayText="N/A" w:value="N/A"/>
             </w:dropDownList>
           </w:sdtPr>
-          <w:sdtEndPr/>
           <w:sdtContent>
             <w:tc>
               <w:tcPr>
@@ -1967,7 +1953,6 @@
               <w:listItem w:displayText="N/A" w:value="N/A"/>
             </w:dropDownList>
           </w:sdtPr>
-          <w:sdtEndPr/>
           <w:sdtContent>
             <w:tc>
               <w:tcPr>
@@ -2015,7 +2000,6 @@
               <w:listItem w:displayText="N/A" w:value="N/A"/>
             </w:dropDownList>
           </w:sdtPr>
-          <w:sdtEndPr/>
           <w:sdtContent>
             <w:tc>
               <w:tcPr>
@@ -2174,7 +2158,6 @@
               <w:listItem w:displayText="N/A" w:value="N/A"/>
             </w:dropDownList>
           </w:sdtPr>
-          <w:sdtEndPr/>
           <w:sdtContent>
             <w:tc>
               <w:tcPr>
@@ -2222,7 +2205,6 @@
               <w:listItem w:displayText="N/A" w:value="N/A"/>
             </w:dropDownList>
           </w:sdtPr>
-          <w:sdtEndPr/>
           <w:sdtContent>
             <w:tc>
               <w:tcPr>
@@ -2270,7 +2252,6 @@
               <w:listItem w:displayText="N/A" w:value="N/A"/>
             </w:dropDownList>
           </w:sdtPr>
-          <w:sdtEndPr/>
           <w:sdtContent>
             <w:tc>
               <w:tcPr>
@@ -2443,7 +2424,6 @@
               <w:listItem w:displayText="N/A" w:value="N/A"/>
             </w:dropDownList>
           </w:sdtPr>
-          <w:sdtEndPr/>
           <w:sdtContent>
             <w:tc>
               <w:tcPr>
@@ -2491,7 +2471,6 @@
               <w:listItem w:displayText="N/A" w:value="N/A"/>
             </w:dropDownList>
           </w:sdtPr>
-          <w:sdtEndPr/>
           <w:sdtContent>
             <w:tc>
               <w:tcPr>
@@ -2539,7 +2518,6 @@
               <w:listItem w:displayText="N/A" w:value="N/A"/>
             </w:dropDownList>
           </w:sdtPr>
-          <w:sdtEndPr/>
           <w:sdtContent>
             <w:tc>
               <w:tcPr>
@@ -2688,7 +2666,6 @@
               <w:listItem w:displayText="N/A" w:value="N/A"/>
             </w:dropDownList>
           </w:sdtPr>
-          <w:sdtEndPr/>
           <w:sdtContent>
             <w:tc>
               <w:tcPr>
@@ -2736,7 +2713,6 @@
               <w:listItem w:displayText="N/A" w:value="N/A"/>
             </w:dropDownList>
           </w:sdtPr>
-          <w:sdtEndPr/>
           <w:sdtContent>
             <w:tc>
               <w:tcPr>
@@ -2784,7 +2760,6 @@
               <w:listItem w:displayText="N/A" w:value="N/A"/>
             </w:dropDownList>
           </w:sdtPr>
-          <w:sdtEndPr/>
           <w:sdtContent>
             <w:tc>
               <w:tcPr>
@@ -2933,7 +2908,6 @@
               <w:listItem w:displayText="N/A" w:value="N/A"/>
             </w:dropDownList>
           </w:sdtPr>
-          <w:sdtEndPr/>
           <w:sdtContent>
             <w:tc>
               <w:tcPr>
@@ -2981,7 +2955,6 @@
               <w:listItem w:displayText="N/A" w:value="N/A"/>
             </w:dropDownList>
           </w:sdtPr>
-          <w:sdtEndPr/>
           <w:sdtContent>
             <w:tc>
               <w:tcPr>
@@ -3029,7 +3002,6 @@
               <w:listItem w:displayText="N/A" w:value="N/A"/>
             </w:dropDownList>
           </w:sdtPr>
-          <w:sdtEndPr/>
           <w:sdtContent>
             <w:tc>
               <w:tcPr>
@@ -3186,7 +3158,6 @@
               <w:listItem w:displayText="N/A" w:value="N/A"/>
             </w:dropDownList>
           </w:sdtPr>
-          <w:sdtEndPr/>
           <w:sdtContent>
             <w:tc>
               <w:tcPr>
@@ -3234,7 +3205,6 @@
               <w:listItem w:displayText="N/A" w:value="N/A"/>
             </w:dropDownList>
           </w:sdtPr>
-          <w:sdtEndPr/>
           <w:sdtContent>
             <w:tc>
               <w:tcPr>
@@ -3282,7 +3252,6 @@
               <w:listItem w:displayText="N/A" w:value="N/A"/>
             </w:dropDownList>
           </w:sdtPr>
-          <w:sdtEndPr/>
           <w:sdtContent>
             <w:tc>
               <w:tcPr>
@@ -3449,7 +3418,6 @@
               <w:listItem w:displayText="N/A" w:value="N/A"/>
             </w:dropDownList>
           </w:sdtPr>
-          <w:sdtEndPr/>
           <w:sdtContent>
             <w:tc>
               <w:tcPr>
@@ -3497,7 +3465,6 @@
               <w:listItem w:displayText="N/A" w:value="N/A"/>
             </w:dropDownList>
           </w:sdtPr>
-          <w:sdtEndPr/>
           <w:sdtContent>
             <w:tc>
               <w:tcPr>
@@ -3545,7 +3512,6 @@
               <w:listItem w:displayText="N/A" w:value="N/A"/>
             </w:dropDownList>
           </w:sdtPr>
-          <w:sdtEndPr/>
           <w:sdtContent>
             <w:tc>
               <w:tcPr>
@@ -3694,7 +3660,6 @@
               <w:listItem w:displayText="N/A" w:value="N/A"/>
             </w:dropDownList>
           </w:sdtPr>
-          <w:sdtEndPr/>
           <w:sdtContent>
             <w:tc>
               <w:tcPr>
@@ -3742,7 +3707,6 @@
               <w:listItem w:displayText="N/A" w:value="N/A"/>
             </w:dropDownList>
           </w:sdtPr>
-          <w:sdtEndPr/>
           <w:sdtContent>
             <w:tc>
               <w:tcPr>
@@ -3790,7 +3754,6 @@
               <w:listItem w:displayText="N/A" w:value="N/A"/>
             </w:dropDownList>
           </w:sdtPr>
-          <w:sdtEndPr/>
           <w:sdtContent>
             <w:tc>
               <w:tcPr>
@@ -3938,7 +3901,6 @@
               <w:listItem w:displayText="N/A" w:value="N/A"/>
             </w:dropDownList>
           </w:sdtPr>
-          <w:sdtEndPr/>
           <w:sdtContent>
             <w:tc>
               <w:tcPr>
@@ -3986,7 +3948,6 @@
               <w:listItem w:displayText="N/A" w:value="N/A"/>
             </w:dropDownList>
           </w:sdtPr>
-          <w:sdtEndPr/>
           <w:sdtContent>
             <w:tc>
               <w:tcPr>
@@ -4034,7 +3995,6 @@
               <w:listItem w:displayText="N/A" w:value="N/A"/>
             </w:dropDownList>
           </w:sdtPr>
-          <w:sdtEndPr/>
           <w:sdtContent>
             <w:tc>
               <w:tcPr>
@@ -4368,7 +4328,6 @@
               <w:listItem w:displayText="N/A" w:value="N/A"/>
             </w:dropDownList>
           </w:sdtPr>
-          <w:sdtEndPr/>
           <w:sdtContent>
             <w:tc>
               <w:tcPr>
@@ -4416,7 +4375,6 @@
               <w:listItem w:displayText="N/A" w:value="N/A"/>
             </w:dropDownList>
           </w:sdtPr>
-          <w:sdtEndPr/>
           <w:sdtContent>
             <w:tc>
               <w:tcPr>
@@ -4461,7 +4419,6 @@
               <w:listItem w:displayText="N/A" w:value="N/A"/>
             </w:dropDownList>
           </w:sdtPr>
-          <w:sdtEndPr/>
           <w:sdtContent>
             <w:tc>
               <w:tcPr>
@@ -4604,7 +4561,6 @@
               <w:listItem w:displayText="N/A" w:value="N/A"/>
             </w:dropDownList>
           </w:sdtPr>
-          <w:sdtEndPr/>
           <w:sdtContent>
             <w:tc>
               <w:tcPr>
@@ -4649,7 +4605,6 @@
               <w:listItem w:displayText="N/A" w:value="N/A"/>
             </w:dropDownList>
           </w:sdtPr>
-          <w:sdtEndPr/>
           <w:sdtContent>
             <w:tc>
               <w:tcPr>
@@ -4694,7 +4649,6 @@
               <w:listItem w:displayText="N/A" w:value="N/A"/>
             </w:dropDownList>
           </w:sdtPr>
-          <w:sdtEndPr/>
           <w:sdtContent>
             <w:tc>
               <w:tcPr>
@@ -4847,7 +4801,6 @@
               <w:listItem w:displayText="N/A" w:value="N/A"/>
             </w:dropDownList>
           </w:sdtPr>
-          <w:sdtEndPr/>
           <w:sdtContent>
             <w:tc>
               <w:tcPr>
@@ -4892,7 +4845,6 @@
               <w:listItem w:displayText="N/A" w:value="N/A"/>
             </w:dropDownList>
           </w:sdtPr>
-          <w:sdtEndPr/>
           <w:sdtContent>
             <w:tc>
               <w:tcPr>
@@ -4937,7 +4889,6 @@
               <w:listItem w:displayText="N/A" w:value="N/A"/>
             </w:dropDownList>
           </w:sdtPr>
-          <w:sdtEndPr/>
           <w:sdtContent>
             <w:tc>
               <w:tcPr>
@@ -5082,7 +5033,6 @@
               <w:listItem w:displayText="N/A" w:value="N/A"/>
             </w:dropDownList>
           </w:sdtPr>
-          <w:sdtEndPr/>
           <w:sdtContent>
             <w:tc>
               <w:tcPr>
@@ -5127,7 +5077,6 @@
               <w:listItem w:displayText="N/A" w:value="N/A"/>
             </w:dropDownList>
           </w:sdtPr>
-          <w:sdtEndPr/>
           <w:sdtContent>
             <w:tc>
               <w:tcPr>
@@ -5172,7 +5121,6 @@
               <w:listItem w:displayText="N/A" w:value="N/A"/>
             </w:dropDownList>
           </w:sdtPr>
-          <w:sdtEndPr/>
           <w:sdtContent>
             <w:tc>
               <w:tcPr>
@@ -5325,7 +5273,6 @@
               <w:listItem w:displayText="N/A" w:value="N/A"/>
             </w:dropDownList>
           </w:sdtPr>
-          <w:sdtEndPr/>
           <w:sdtContent>
             <w:tc>
               <w:tcPr>
@@ -5370,7 +5317,6 @@
               <w:listItem w:displayText="N/A" w:value="N/A"/>
             </w:dropDownList>
           </w:sdtPr>
-          <w:sdtEndPr/>
           <w:sdtContent>
             <w:tc>
               <w:tcPr>
@@ -5415,7 +5361,6 @@
               <w:listItem w:displayText="N/A" w:value="N/A"/>
             </w:dropDownList>
           </w:sdtPr>
-          <w:sdtEndPr/>
           <w:sdtContent>
             <w:tc>
               <w:tcPr>
@@ -5610,7 +5555,6 @@
               <w:listItem w:displayText="N/A" w:value="N/A"/>
             </w:dropDownList>
           </w:sdtPr>
-          <w:sdtEndPr/>
           <w:sdtContent>
             <w:tc>
               <w:tcPr>
@@ -5655,7 +5599,6 @@
               <w:listItem w:displayText="N/A" w:value="N/A"/>
             </w:dropDownList>
           </w:sdtPr>
-          <w:sdtEndPr/>
           <w:sdtContent>
             <w:tc>
               <w:tcPr>
@@ -5700,7 +5643,6 @@
               <w:listItem w:displayText="N/A" w:value="N/A"/>
             </w:dropDownList>
           </w:sdtPr>
-          <w:sdtEndPr/>
           <w:sdtContent>
             <w:tc>
               <w:tcPr>
@@ -5871,7 +5813,6 @@
               <w:listItem w:displayText="N/A" w:value="N/A"/>
             </w:dropDownList>
           </w:sdtPr>
-          <w:sdtEndPr/>
           <w:sdtContent>
             <w:tc>
               <w:tcPr>
@@ -5916,7 +5857,6 @@
               <w:listItem w:displayText="N/A" w:value="N/A"/>
             </w:dropDownList>
           </w:sdtPr>
-          <w:sdtEndPr/>
           <w:sdtContent>
             <w:tc>
               <w:tcPr>
@@ -5961,7 +5901,6 @@
               <w:listItem w:displayText="N/A" w:value="N/A"/>
             </w:dropDownList>
           </w:sdtPr>
-          <w:sdtEndPr/>
           <w:sdtContent>
             <w:tc>
               <w:tcPr>
@@ -6142,7 +6081,6 @@
               <w:listItem w:displayText="N/A" w:value="N/A"/>
             </w:dropDownList>
           </w:sdtPr>
-          <w:sdtEndPr/>
           <w:sdtContent>
             <w:tc>
               <w:tcPr>
@@ -6187,7 +6125,6 @@
               <w:listItem w:displayText="N/A" w:value="N/A"/>
             </w:dropDownList>
           </w:sdtPr>
-          <w:sdtEndPr/>
           <w:sdtContent>
             <w:tc>
               <w:tcPr>
@@ -6232,7 +6169,6 @@
               <w:listItem w:displayText="N/A" w:value="N/A"/>
             </w:dropDownList>
           </w:sdtPr>
-          <w:sdtEndPr/>
           <w:sdtContent>
             <w:tc>
               <w:tcPr>
@@ -6379,7 +6315,6 @@
               <w:listItem w:displayText="N/A" w:value="N/A"/>
             </w:dropDownList>
           </w:sdtPr>
-          <w:sdtEndPr/>
           <w:sdtContent>
             <w:tc>
               <w:tcPr>
@@ -6424,7 +6359,6 @@
               <w:listItem w:displayText="N/A" w:value="N/A"/>
             </w:dropDownList>
           </w:sdtPr>
-          <w:sdtEndPr/>
           <w:sdtContent>
             <w:tc>
               <w:tcPr>
@@ -6469,7 +6403,6 @@
               <w:listItem w:displayText="N/A" w:value="N/A"/>
             </w:dropDownList>
           </w:sdtPr>
-          <w:sdtEndPr/>
           <w:sdtContent>
             <w:tc>
               <w:tcPr>
@@ -6612,7 +6545,6 @@
               <w:listItem w:displayText="N/A" w:value="N/A"/>
             </w:dropDownList>
           </w:sdtPr>
-          <w:sdtEndPr/>
           <w:sdtContent>
             <w:tc>
               <w:tcPr>
@@ -6657,7 +6589,6 @@
               <w:listItem w:displayText="N/A" w:value="N/A"/>
             </w:dropDownList>
           </w:sdtPr>
-          <w:sdtEndPr/>
           <w:sdtContent>
             <w:tc>
               <w:tcPr>
@@ -6715,7 +6646,6 @@
                   <w:listItem w:displayText="N/A" w:value="N/A"/>
                 </w:dropDownList>
               </w:sdtPr>
-              <w:sdtEndPr/>
               <w:sdtContent>
                 <w:r>
                   <w:rPr>
@@ -6843,7 +6773,6 @@
               <w:listItem w:displayText="N/A" w:value="N/A"/>
             </w:dropDownList>
           </w:sdtPr>
-          <w:sdtEndPr/>
           <w:sdtContent>
             <w:tc>
               <w:tcPr>
@@ -6888,7 +6817,6 @@
               <w:listItem w:displayText="N/A" w:value="N/A"/>
             </w:dropDownList>
           </w:sdtPr>
-          <w:sdtEndPr/>
           <w:sdtContent>
             <w:tc>
               <w:tcPr>
@@ -6933,7 +6861,6 @@
               <w:listItem w:displayText="N/A" w:value="N/A"/>
             </w:dropDownList>
           </w:sdtPr>
-          <w:sdtEndPr/>
           <w:sdtContent>
             <w:tc>
               <w:tcPr>
@@ -7109,7 +7036,6 @@
                   <w14:uncheckedState w14:val="2610" w14:font="MS Gothic"/>
                 </w14:checkbox>
               </w:sdtPr>
-              <w:sdtEndPr/>
               <w:sdtContent>
                 <w:r>
                   <w:rPr>
@@ -7196,7 +7122,6 @@
             <w14:uncheckedState w14:val="2610" w14:font="MS Gothic"/>
           </w14:checkbox>
         </w:sdtPr>
-        <w:sdtEndPr/>
         <w:sdtContent>
           <w:r>
             <w:rPr>
@@ -7248,7 +7173,6 @@
             <w14:uncheckedState w14:val="2610" w14:font="MS Gothic"/>
           </w14:checkbox>
         </w:sdtPr>
-        <w:sdtEndPr/>
         <w:sdtContent>
           <w:r>
             <w:rPr>
@@ -7300,7 +7224,6 @@
             <w14:uncheckedState w14:val="2610" w14:font="MS Gothic"/>
           </w14:checkbox>
         </w:sdtPr>
-        <w:sdtEndPr/>
         <w:sdtContent>
           <w:r>
             <w:rPr>
@@ -7344,7 +7267,6 @@
             <w14:uncheckedState w14:val="2610" w14:font="MS Gothic"/>
           </w14:checkbox>
         </w:sdtPr>
-        <w:sdtEndPr/>
         <w:sdtContent>
           <w:r>
             <w:rPr>
@@ -7396,7 +7318,6 @@
             <w14:uncheckedState w14:val="2610" w14:font="MS Gothic"/>
           </w14:checkbox>
         </w:sdtPr>
-        <w:sdtEndPr/>
         <w:sdtContent>
           <w:r>
             <w:rPr>
@@ -7822,7 +7743,6 @@
             <w14:uncheckedState w14:val="2610" w14:font="MS Gothic"/>
           </w14:checkbox>
         </w:sdtPr>
-        <w:sdtEndPr/>
         <w:sdtContent>
           <w:r>
             <w:rPr>
@@ -7856,7 +7776,6 @@
             <w14:uncheckedState w14:val="2610" w14:font="MS Gothic"/>
           </w14:checkbox>
         </w:sdtPr>
-        <w:sdtEndPr/>
         <w:sdtContent>
           <w:r>
             <w:rPr>
@@ -7890,7 +7809,6 @@
             <w14:uncheckedState w14:val="2610" w14:font="MS Gothic"/>
           </w14:checkbox>
         </w:sdtPr>
-        <w:sdtEndPr/>
         <w:sdtContent>
           <w:r>
             <w:rPr>
@@ -7926,7 +7844,6 @@
             <w:calendar w:val="gregorian"/>
           </w:date>
         </w:sdtPr>
-        <w:sdtEndPr/>
         <w:sdtContent>
           <w:r>
             <w:rPr>
@@ -10835,7 +10752,7 @@
     <w:charset w:val="00"/>
     <w:family w:val="swiss"/>
     <w:pitch w:val="variable"/>
-    <w:sig w:usb0="E4002EFF" w:usb1="C000247B" w:usb2="00000009" w:usb3="00000000" w:csb0="000001FF" w:csb1="00000000"/>
+    <w:sig w:usb0="E4002EFF" w:usb1="C200247B" w:usb2="00000009" w:usb3="00000000" w:csb0="000001FF" w:csb1="00000000"/>
   </w:font>
   <w:font w:name="Tahoma">
     <w:panose1 w:val="020B0604030504040204"/>
@@ -10902,6 +10819,9 @@
     <w:rsid w:val="00450780"/>
     <w:rsid w:val="00457B56"/>
     <w:rsid w:val="004878B0"/>
+    <w:rsid w:val="004B0470"/>
+    <w:rsid w:val="004F57EF"/>
+    <w:rsid w:val="006659FD"/>
     <w:rsid w:val="006A6F3F"/>
     <w:rsid w:val="007B38A6"/>
     <w:rsid w:val="007E7ACB"/>

</xml_diff>